<commit_message>
feat: gestion dynamique du Point Focal, cockpit dashboard executif et referentiels BCC
</commit_message>
<xml_diff>
--- a/doc/Projet_Application_Suivi_Ordres_Instructions_Gouverneur.docx
+++ b/doc/Projet_Application_Suivi_Ordres_Instructions_Gouverneur.docx
@@ -15,7 +15,7 @@
           <w:noProof/>
         </w:rPr>
         <w:drawing>
-          <wp:anchor distT="0" distB="0" distL="114300" distR="114300" simplePos="0" relativeHeight="251659264" behindDoc="0" locked="0" layoutInCell="1" allowOverlap="1" wp14:anchorId="7F471A6E" wp14:editId="2651F12C">
+          <wp:anchor distT="0" distB="0" distL="114300" distR="114300" simplePos="0" relativeHeight="251658240" behindDoc="0" locked="0" layoutInCell="1" allowOverlap="1" wp14:anchorId="7F471A6E" wp14:editId="2651F12C">
             <wp:simplePos x="0" y="0"/>
             <wp:positionH relativeFrom="column">
               <wp:posOffset>705892</wp:posOffset>
@@ -186,9 +186,8 @@
       <w:pPr>
         <w:jc w:val="center"/>
         <w:rPr>
-          <w:rFonts w:ascii="Aptos Display" w:hAnsi="Aptos Display"/>
           <w:b/>
-          <w:sz w:val="50"/>
+          <w:sz w:val="24"/>
         </w:rPr>
       </w:pPr>
     </w:p>
@@ -196,14 +195,36 @@
       <w:pPr>
         <w:jc w:val="center"/>
         <w:rPr>
+          <w:b/>
+          <w:sz w:val="24"/>
+        </w:rPr>
+      </w:pPr>
+    </w:p>
+    <w:p>
+      <w:pPr>
+        <w:jc w:val="center"/>
+        <w:rPr>
+          <w:b/>
+          <w:sz w:val="24"/>
+        </w:rPr>
+      </w:pPr>
+    </w:p>
+    <w:p>
+      <w:pPr>
+        <w:shd w:val="clear" w:color="auto" w:fill="17365D" w:themeFill="text2" w:themeFillShade="BF"/>
+        <w:jc w:val="center"/>
+        <w:rPr>
           <w:rFonts w:hint="eastAsia"/>
+          <w:sz w:val="32"/>
+          <w:szCs w:val="32"/>
         </w:rPr>
       </w:pPr>
       <w:r>
         <w:rPr>
           <w:rFonts w:ascii="Aptos Display" w:hAnsi="Aptos Display"/>
           <w:b/>
-          <w:sz w:val="50"/>
+          <w:sz w:val="32"/>
+          <w:szCs w:val="32"/>
         </w:rPr>
         <w:t xml:space="preserve">Système de </w:t>
       </w:r>
@@ -212,7 +233,8 @@
         <w:rPr>
           <w:rFonts w:ascii="Aptos Display" w:hAnsi="Aptos Display"/>
           <w:b/>
-          <w:sz w:val="50"/>
+          <w:sz w:val="32"/>
+          <w:szCs w:val="32"/>
         </w:rPr>
         <w:t>Suivi</w:t>
       </w:r>
@@ -221,7 +243,8 @@
         <w:rPr>
           <w:rFonts w:ascii="Aptos Display" w:hAnsi="Aptos Display"/>
           <w:b/>
-          <w:sz w:val="50"/>
+          <w:sz w:val="32"/>
+          <w:szCs w:val="32"/>
         </w:rPr>
         <w:t xml:space="preserve"> des</w:t>
       </w:r>
@@ -229,16 +252,18 @@
         <w:rPr>
           <w:rFonts w:ascii="Aptos Display" w:hAnsi="Aptos Display"/>
           <w:b/>
-          <w:sz w:val="50"/>
+          <w:sz w:val="32"/>
+          <w:szCs w:val="32"/>
         </w:rPr>
-        <w:br/>
+        <w:t xml:space="preserve"> </w:t>
       </w:r>
       <w:proofErr w:type="spellStart"/>
       <w:r>
         <w:rPr>
           <w:rFonts w:ascii="Aptos Display" w:hAnsi="Aptos Display"/>
           <w:b/>
-          <w:sz w:val="50"/>
+          <w:sz w:val="32"/>
+          <w:szCs w:val="32"/>
         </w:rPr>
         <w:t>Ordres</w:t>
       </w:r>
@@ -247,9 +272,25 @@
         <w:rPr>
           <w:rFonts w:ascii="Aptos Display" w:hAnsi="Aptos Display"/>
           <w:b/>
-          <w:sz w:val="50"/>
+          <w:sz w:val="32"/>
+          <w:szCs w:val="32"/>
         </w:rPr>
         <w:t xml:space="preserve"> de Service et Instructions du Gouverneur</w:t>
+      </w:r>
+    </w:p>
+    <w:p>
+      <w:pPr>
+        <w:rPr>
+          <w:i/>
+          <w:sz w:val="24"/>
+        </w:rPr>
+      </w:pPr>
+      <w:r>
+        <w:rPr>
+          <w:i/>
+          <w:sz w:val="24"/>
+        </w:rPr>
+        <w:br w:type="page"/>
       </w:r>
     </w:p>
     <w:p>
@@ -264,6 +305,7 @@
           <w:i/>
           <w:sz w:val="24"/>
         </w:rPr>
+        <w:lastRenderedPageBreak/>
         <w:br/>
         <w:t xml:space="preserve">Proposition </w:t>
       </w:r>

</xml_diff>